<commit_message>
docs: PRD v2.0 review corrections (autocomplete, PRO board, responsiveness)
Apply Solomiia's review feedback to both PRD variants:
- Growth Features: address autocomplete is already in MVP (FR-3.5) — the
  Post-MVP row now covers item autocomplete only
- PRO tier: Schedule Board is multi-technician AND multi-industry with
  filters (also fixed in both "remain PRO" mentions)
- Remove responsive tablet/phone promises from MVP scope: web app only;
  responsive layouts moved to Growth Features as a nice-to-have requiring
  a separate estimate incl. design work; user-journey note, success
  criteria, breakpoints, platforms, constraints and assumptions adjusted
- FR-4: import must map the full item model (types/categories incl. price
  book, retail price, cost, tax) to the frontend — acceptance criteria
  extended and an open-point bullet added

Co-Authored-By: Claude Opus 4.8 <noreply@anthropic.com>
Claude-Session: https://claude.ai/code/session_01LE6ZxZczxL79W1XjLYGoUj
</commit_message>
<xml_diff>
--- a/Vision360 - PRD v2.0 (clean).docx
+++ b/Vision360 - PRD v2.0 (clean).docx
@@ -2490,7 +2490,13 @@
         <w:pStyle w:val="BodyText"/>
       </w:pPr>
       <w:r>
-        <w:t>Vision 360 CORE is a web-first Field Service Management (FSM) platform (responsive web in MVP; a native mobile app is a Post-MVP growth feature) purpose-built for solo home service operators — HVAC technicians, plumbers, electricians, roofers, pool cleaners, and similar tradespeople who run their entire business from their vehicle.</w:t>
+        <w:t xml:space="preserve">Vision 360 CORE is a web-first Field Service Management (FSM) platform </w:t>
+      </w:r>
+      <w:r>
+        <w:t>(web app in MVP; a native mobile app is a Post-MVP growth feature)</w:t>
+      </w:r>
+      <w:r>
+        <w:t xml:space="preserve"> purpose-built for solo home service operators — HVAC technicians, plumbers, electricians, roofers, pool cleaners, and similar tradespeople who run their entire business from their vehicle.</w:t>
       </w:r>
     </w:p>
     <w:p>
@@ -2720,7 +2726,10 @@
               <w:pStyle w:val="Compact"/>
             </w:pPr>
             <w:r>
-              <w:t>SaaS B2B — Web-first (responsive web in MVP; native mobile app Post-MVP)</w:t>
+              <w:t xml:space="preserve">SaaS B2B — </w:t>
+            </w:r>
+            <w:r>
+              <w:t>Web-first (web app in MVP; native mobile app Post-MVP)</w:t>
             </w:r>
           </w:p>
         </w:tc>
@@ -3662,10 +3671,7 @@
               <w:pStyle w:val="Compact"/>
             </w:pPr>
             <w:r>
-              <w:rPr>
-                <w:b/>
-              </w:rPr>
-              <w:t>Responsiveness</w:t>
+              <w:t>Web experience</w:t>
             </w:r>
           </w:p>
         </w:tc>
@@ -3679,7 +3685,7 @@
               <w:pStyle w:val="Compact"/>
             </w:pPr>
             <w:r>
-              <w:t>Seamless on phone, tablet, desktop</w:t>
+              <w:t>First-class desktop web experience</w:t>
             </w:r>
           </w:p>
         </w:tc>
@@ -3693,7 +3699,7 @@
               <w:pStyle w:val="Compact"/>
             </w:pPr>
             <w:r>
-              <w:t>Works in vehicle (phone), at kitchen table (tablet), home office (desktop)</w:t>
+              <w:t>Primary usage is desktop/web; field usage arrives with the Post-MVP native app</w:t>
             </w:r>
           </w:p>
         </w:tc>
@@ -3819,7 +3825,13 @@
         <w:t>web-first</w:t>
       </w:r>
       <w:r>
-        <w:t xml:space="preserve"> — desktop/web is the primary target (~99% of use), responsive down to tablet/phone; the native field mobile app is Post-MVP. Read the “Responsiveness” row above in that light.</w:t>
+        <w:t xml:space="preserve"> — desktop/web is the primary target (~99% of use)</w:t>
+      </w:r>
+      <w:r>
+        <w:t xml:space="preserve">; the native field mobile app is Post-MVP. </w:t>
+      </w:r>
+      <w:r>
+        <w:t>Responsive tablet/phone layouts are not in MVP scope — they are a nice-to-have to be estimated separately (including design work).</w:t>
       </w:r>
     </w:p>
     <w:p>
@@ -3869,7 +3881,13 @@
         <w:t>Technical Outcome:</w:t>
       </w:r>
       <w:r>
-        <w:t xml:space="preserve"> “The app works reliably on any device, and no user has ever lost data.”</w:t>
+        <w:t xml:space="preserve"> “</w:t>
+      </w:r>
+      <w:r>
+        <w:t>The app works reliably in the browser</w:t>
+      </w:r>
+      <w:r>
+        <w:t>, and no user has ever lost data.”</w:t>
       </w:r>
     </w:p>
     <w:p>
@@ -3984,7 +4002,7 @@
         <w:t>web-first</w:t>
       </w:r>
       <w:r>
-        <w:t xml:space="preserve"> design — optimized for desktop/web (~99% of use), responsive down to tablet/phone</w:t>
+        <w:t xml:space="preserve"> design — optimized for desktop/web (~99% of use)</w:t>
       </w:r>
       <w:r>
         <w:t xml:space="preserve"> · </w:t>
@@ -4034,7 +4052,13 @@
         <w:t>movable/floating route map</w:t>
       </w:r>
       <w:r>
-        <w:t>. Advanced multi-technician scheduling, business units and route optimization remain PRO.</w:t>
+        <w:t xml:space="preserve">. </w:t>
+      </w:r>
+      <w:r>
+        <w:t>Advanced multi-technician / multi-industry scheduling with filters, business units</w:t>
+      </w:r>
+      <w:r>
+        <w:t xml:space="preserve"> and route optimization remain PRO.</w:t>
       </w:r>
     </w:p>
     <w:p>
@@ -4229,7 +4253,7 @@
               <w:pStyle w:val="Compact"/>
             </w:pPr>
             <w:r>
-              <w:t>Autocomplete</w:t>
+              <w:t>Item Autocomplete</w:t>
             </w:r>
           </w:p>
         </w:tc>
@@ -4243,7 +4267,7 @@
               <w:pStyle w:val="Compact"/>
             </w:pPr>
             <w:r>
-              <w:t>Address and item autocomplete for faster data entry</w:t>
+              <w:t>Item autocomplete for faster data entry — address autocomplete is already in MVP (FR-3.5)</w:t>
             </w:r>
           </w:p>
         </w:tc>
@@ -4297,6 +4321,53 @@
         <w:tc>
           <w:tcPr>
             <w:tcW w:type="dxa" w:w="3600"/>
+            <w:tcW w:w="2161" w:type="dxa"/>
+          </w:tcPr>
+          <w:p>
+            <w:pPr>
+              <w:pStyle w:val="Compact"/>
+            </w:pPr>
+            <w:r>
+              <w:t>Medium</w:t>
+            </w:r>
+          </w:p>
+        </w:tc>
+      </w:tr>
+      <w:tr>
+        <w:trPr>
+          <w:cantSplit/>
+        </w:trPr>
+        <w:tc>
+          <w:tcPr>
+            <w:tcW w:type="dxa" w:w="2303"/>
+            <w:tcW w:w="2303" w:type="dxa"/>
+          </w:tcPr>
+          <w:p>
+            <w:pPr>
+              <w:pStyle w:val="Compact"/>
+            </w:pPr>
+            <w:r>
+              <w:t>Responsive Web Layouts (Tablet/Phone)</w:t>
+            </w:r>
+          </w:p>
+        </w:tc>
+        <w:tc>
+          <w:tcPr>
+            <w:tcW w:type="dxa" w:w="6336"/>
+            <w:tcW w:w="6336" w:type="dxa"/>
+          </w:tcPr>
+          <w:p>
+            <w:pPr>
+              <w:pStyle w:val="Compact"/>
+            </w:pPr>
+            <w:r>
+              <w:t>Tablet/phone browser layouts — nice-to-have; requires a separate estimate, including design work</w:t>
+            </w:r>
+          </w:p>
+        </w:tc>
+        <w:tc>
+          <w:tcPr>
+            <w:tcW w:type="dxa" w:w="2161"/>
             <w:tcW w:w="2161" w:type="dxa"/>
           </w:tcPr>
           <w:p>
@@ -4406,7 +4477,10 @@
               <w:pStyle w:val="Compact"/>
             </w:pPr>
             <w:r>
-              <w:t>Advanced multi-technician Schedule Board, Inventory, QuickBooks integration, business units, route optimization</w:t>
+              <w:t>Advanced multi-technician / multi-industry Schedule Board with filters</w:t>
+            </w:r>
+            <w:r>
+              <w:t>, Inventory, QuickBooks integration, business units, route optimization</w:t>
             </w:r>
           </w:p>
         </w:tc>
@@ -4503,25 +4577,10 @@
         <w:t>v2.0 note:</w:t>
       </w:r>
       <w:r>
-        <w:t xml:space="preserve"> These journeys are aspirational persona stories, retained as-is. MVP delivery is </w:t>
-      </w:r>
-      <w:r>
-        <w:rPr>
-          <w:b/>
-        </w:rPr>
-        <w:t>web-first</w:t>
-      </w:r>
-      <w:r>
-        <w:t xml:space="preserve"> (responsive web); the on-site/phone usage some journeys imply runs responsively in the browser, while a dedicated native field app is a </w:t>
-      </w:r>
-      <w:r>
-        <w:rPr>
-          <w:b/>
-        </w:rPr>
-        <w:t>Post-MVP</w:t>
-      </w:r>
-      <w:r>
-        <w:t xml:space="preserve"> growth feature</w:t>
+        <w:t xml:space="preserve"> These journeys are aspirational persona stories, retained as-is. </w:t>
+      </w:r>
+      <w:r>
+        <w:t>MVP delivery is a desktop web app; the on-site/phone usage some journeys imply belongs to the Post-MVP native field app — responsive browser layouts are a separate nice-to-have (estimated separately, including design work)</w:t>
       </w:r>
       <w:r>
         <w:t>.</w:t>
@@ -4656,7 +4715,7 @@
               <w:pStyle w:val="Compact"/>
             </w:pPr>
             <w:r>
-              <w:t>Vision 360 app (web responsive)</w:t>
+              <w:t>Vision 360 app (web)</w:t>
             </w:r>
           </w:p>
         </w:tc>
@@ -4916,7 +4975,13 @@
         <w:pStyle w:val="BodyText"/>
       </w:pPr>
       <w:r>
-        <w:t>In 45 seconds, he shows Mrs. Rodriguez the estimate on his phone. “I can email this to you right now with both options. You sign electronically, and we’re good to go.”</w:t>
+        <w:t xml:space="preserve">In 45 seconds, he shows Mrs. Rodriguez </w:t>
+      </w:r>
+      <w:r>
+        <w:t>the estimate. “I can email</w:t>
+      </w:r>
+      <w:r>
+        <w:t xml:space="preserve"> this to you right now with both options. You sign electronically, and we’re good to go.”</w:t>
       </w:r>
     </w:p>
     <w:p>
@@ -4938,7 +5003,13 @@
         <w:t>Capabilities Revealed:</w:t>
       </w:r>
       <w:r>
-        <w:t xml:space="preserve"> Quick create menu, client selection with auto-fill, item catalog, multi-option estimates, on-device preview, email send.</w:t>
+        <w:t xml:space="preserve"> Quick create menu, client selection with auto-fill, item catalog, multi-option estimates, </w:t>
+      </w:r>
+      <w:r>
+        <w:t>on-screen preview</w:t>
+      </w:r>
+      <w:r>
+        <w:t>, email send.</w:t>
       </w:r>
     </w:p>
     <w:p>
@@ -8417,7 +8488,7 @@
               <w:pStyle w:val="Compact"/>
             </w:pPr>
             <w:r>
-              <w:t>CSV template provided; import validates data before committing</w:t>
+              <w:t>CSV template provided; import validates data before committing; the template must cover the full item model — type/category (incl. price book), retail price, cost, tax — matching the frontend fields</w:t>
             </w:r>
           </w:p>
         </w:tc>
@@ -8790,6 +8861,24 @@
       </w:r>
       <w:r>
         <w:t>.</w:t>
+      </w:r>
+    </w:p>
+    <w:p>
+      <w:pPr>
+        <w:pStyle w:val="Compact"/>
+        <w:numPr>
+          <w:ilvl w:val="0"/>
+          <w:numId w:val="3001"/>
+        </w:numPr>
+      </w:pPr>
+      <w:r>
+        <w:rPr>
+          <w:b/>
+        </w:rPr>
+        <w:t xml:space="preserve">⚠ To verify — spreadsheet import: </w:t>
+      </w:r>
+      <w:r>
+        <w:t>confirm exactly how the upload maps to the item model — items span different types/categories (including price-book items) and carry retail price, cost, and tax; the import template and fields must match the frontend.</w:t>
       </w:r>
     </w:p>
     <w:p>
@@ -13918,7 +14007,10 @@
         </w:numPr>
       </w:pPr>
       <w:r>
-        <w:t xml:space="preserve">Advanced multi-technician board, business units and route optimization remain </w:t>
+        <w:t>Advanced multi-technician / multi-industry board with filters, business units</w:t>
+      </w:r>
+      <w:r>
+        <w:t xml:space="preserve"> and route optimization remain </w:t>
       </w:r>
       <w:r>
         <w:rPr>
@@ -17135,7 +17227,10 @@
               <w:pStyle w:val="Compact"/>
             </w:pPr>
             <w:r>
-              <w:t>Design for desktop/web first (~99% of use); responsive down to tablet/phone; native field app Post-MVP</w:t>
+              <w:t>Design for desktop/web first (~99% of use)</w:t>
+            </w:r>
+            <w:r>
+              <w:t>; native field app Post-MVP</w:t>
             </w:r>
           </w:p>
         </w:tc>
@@ -17349,7 +17444,10 @@
         <w:t>desktop is the primary target</w:t>
       </w:r>
       <w:r>
-        <w:t>; tablet/phone remain responsive</w:t>
+        <w:t xml:space="preserve">; </w:t>
+      </w:r>
+      <w:r>
+        <w:t>tablet/phone responsive layouts are a nice-to-have outside MVP scope (estimated separately, incl. design work)</w:t>
       </w:r>
       <w:r>
         <w:t>.</w:t>
@@ -17520,7 +17618,7 @@
               <w:pStyle w:val="Compact"/>
             </w:pPr>
             <w:r>
-              <w:t>Collapsible navigation</w:t>
+              <w:t>Collapsible navigation (nice-to-have, not in MVP)</w:t>
             </w:r>
           </w:p>
         </w:tc>
@@ -17567,7 +17665,7 @@
               <w:pStyle w:val="Compact"/>
             </w:pPr>
             <w:r>
-              <w:t>Bottom navigation, hamburger menu</w:t>
+              <w:t>Bottom navigation, hamburger menu (nice-to-have, not in MVP)</w:t>
             </w:r>
           </w:p>
         </w:tc>
@@ -18462,7 +18560,7 @@
         </w:numPr>
       </w:pPr>
       <w:r>
-        <w:t>Responsive: Desktop, Tablet, Mobile layouts</w:t>
+        <w:t>Desktop web layouts — tablet/mobile responsive layouts are a nice-to-have, estimated separately</w:t>
       </w:r>
     </w:p>
     <w:p>
@@ -20504,7 +20602,10 @@
               <w:pStyle w:val="Compact"/>
             </w:pPr>
             <w:r>
-              <w:t>Responsive web app is primary interface; native mobile deferred 8-12 weeks</w:t>
+              <w:t>Web app is primary interface</w:t>
+            </w:r>
+            <w:r>
+              <w:t>; native mobile deferred 8-12 weeks</w:t>
             </w:r>
           </w:p>
         </w:tc>
@@ -20786,7 +20887,10 @@
               <w:pStyle w:val="Compact"/>
             </w:pPr>
             <w:r>
-              <w:t>Responsive web application is the primary interface for CORE</w:t>
+              <w:t>Web application is the primary interface</w:t>
+            </w:r>
+            <w:r>
+              <w:t xml:space="preserve"> for CORE</w:t>
             </w:r>
           </w:p>
         </w:tc>

</xml_diff>